<commit_message>
Update site and resume for new role at Blue Line Solutions
Co-Authored-By: Claude Fable 5 <noreply@anthropic.com>
</commit_message>
<xml_diff>
--- a/Kyle-Mitchell-Resume.docx
+++ b/Kyle-Mitchell-Resume.docx
@@ -97,7 +97,7 @@
           <w:sz w:val="18"/>
           <w:szCs w:val="18"/>
         </w:rPr>
-        <w:t xml:space="preserve">Full-stack engineer with hands-on experience in JavaScript and React paired with ASP.NET Core on the backend. Shipped a containerized, CI/CD-deployed task management app on Azure Kubernetes Service in under six months and executed a security overhaul of production APIs. Proficient with Docker, Kubernetes, Terraform, Azure DevOps and PostgreSQL, seeking to drive scalable solutions in a fast-paced environment.</w:t>
+        <w:t xml:space="preserve">Full-stack engineer with hands-on experience in JavaScript and React paired with ASP.NET Core on the backend. Shipped a containerized, CI/CD-deployed task management app on Azure Kubernetes Service in under six months and executed a security overhaul of production APIs. Proficient with Docker, Kubernetes, Terraform, Azure DevOps and PostgreSQL, now building scalable solutions as a Software Engineer at Blue Line Solutions.</w:t>
       </w:r>
     </w:p>
     <w:p>
@@ -135,6 +135,69 @@
           <w:sz w:val="19"/>
           <w:szCs w:val="19"/>
         </w:rPr>
+        <w:t xml:space="preserve">Blue Line Solutions</w:t>
+      </w:r>
+      <w:r>
+        <w:rPr>
+          <w:rFonts w:ascii="Calibri" w:cs="Calibri" w:eastAsia="Calibri" w:hAnsi="Calibri"/>
+          <w:color w:val="2F2F2F"/>
+          <w:sz w:val="18"/>
+          <w:szCs w:val="18"/>
+        </w:rPr>
+        <w:t xml:space="preserve"/>
+      </w:r>
+      <w:r>
+        <w:rPr>
+          <w:rFonts w:ascii="Calibri" w:cs="Calibri" w:eastAsia="Calibri" w:hAnsi="Calibri"/>
+          <w:sz w:val="18"/>
+          <w:szCs w:val="18"/>
+        </w:rPr>
+        <w:t xml:space="preserve">	</w:t>
+      </w:r>
+      <w:r>
+        <w:rPr>
+          <w:rFonts w:ascii="Calibri" w:cs="Calibri" w:eastAsia="Calibri" w:hAnsi="Calibri"/>
+          <w:color w:val="2F2F2F"/>
+          <w:sz w:val="18"/>
+          <w:szCs w:val="18"/>
+        </w:rPr>
+        <w:t xml:space="preserve">Jul 2026 - Present</w:t>
+      </w:r>
+    </w:p>
+    <w:p>
+      <w:pPr>
+        <w:spacing w:after="10" w:before="10"/>
+      </w:pPr>
+      <w:r>
+        <w:rPr>
+          <w:rFonts w:ascii="Calibri" w:cs="Calibri" w:eastAsia="Calibri" w:hAnsi="Calibri"/>
+          <w:b/>
+          <w:bCs/>
+          <w:i/>
+          <w:iCs/>
+          <w:color w:val="000000"/>
+          <w:sz w:val="18"/>
+          <w:szCs w:val="18"/>
+        </w:rPr>
+        <w:t xml:space="preserve">Software Engineer</w:t>
+      </w:r>
+    </w:p>
+    <w:p>
+      <w:pPr>
+        <w:tabs>
+          <w:tab w:val="right" w:pos="11000"/>
+        </w:tabs>
+        <w:spacing w:after="0" w:before="40"/>
+      </w:pPr>
+      <w:r>
+        <w:rPr>
+          <w:rFonts w:ascii="Calibri" w:cs="Calibri" w:eastAsia="Calibri" w:hAnsi="Calibri"/>
+          <w:b/>
+          <w:bCs/>
+          <w:color w:val="000000"/>
+          <w:sz w:val="19"/>
+          <w:szCs w:val="19"/>
+        </w:rPr>
         <w:t xml:space="preserve">Independent</w:t>
       </w:r>
       <w:r>
@@ -144,7 +207,7 @@
           <w:sz w:val="18"/>
           <w:szCs w:val="18"/>
         </w:rPr>
-        <w:t xml:space="preserve"> - Self-directed work under senior engineer mentorship</w:t>
+        <w:t xml:space="preserve"> - Self-directed work with personal mentorship from an experienced software engineer</w:t>
       </w:r>
       <w:r>
         <w:rPr>

</xml_diff>